<commit_message>
Added metadata to reports when compiling
</commit_message>
<xml_diff>
--- a/src/Layers/W1/BaseApp/CRM/DefaultEmailMergeDoc.docx
+++ b/src/Layers/W1/BaseApp/CRM/DefaultEmailMergeDoc.docx
@@ -1883,6 +1883,84 @@
  
          < / R e p o r t R e q u e s t >   
+         < C o m p a n y M e t a d a t a > + 
+             < C o m p a n y N a m e > C o m p a n y   N a m e < / C o m p a n y N a m e > + 
+             < C o m p a n y D i s p l a y N a m e > C o m p a n y   D i s p l a y   N a m e < / C o m p a n y D i s p l a y N a m e > + 
+             < C o m p a n y A d d r e s s L i n e s > + 
+                 < C o m p a n y A d d r e s s L i n e > C o m p a n y   A d d r e s s   L i n e   1 < / C o m p a n y A d d r e s s L i n e > + 
+                 < C o m p a n y A d d r e s s L i n e > C o m p a n y   A d d r e s s   L i n e   2 < / C o m p a n y A d d r e s s L i n e > + 
+                 < C o m p a n y A d d r e s s L i n e > C o m p a n y   A d d r e s s   L i n e   3 < / C o m p a n y A d d r e s s L i n e > + 
+                 < C o m p a n y A d d r e s s L i n e > C o m p a n y   A d d r e s s   L i n e   4 < / C o m p a n y A d d r e s s L i n e > + 
+                 < C o m p a n y A d d r e s s L i n e > C o m p a n y   A d d r e s s   L i n e   5 < / C o m p a n y A d d r e s s L i n e > + 
+                 < C o m p a n y A d d r e s s L i n e > C o m p a n y   A d d r e s s   L i n e   6 < / C o m p a n y A d d r e s s L i n e > + 
+                 < C o m p a n y A d d r e s s L i n e > C o m p a n y   A d d r e s s   L i n e   7 < / C o m p a n y A d d r e s s L i n e > + 
+                 < C o m p a n y A d d r e s s L i n e > C o m p a n y   A d d r e s s   L i n e   8 < / C o m p a n y A d d r e s s L i n e > + 
+             < / C o m p a n y A d d r e s s L i n e s > + 
+             < C o m p a n y P h o n e > C o m p a n y   P h o n e < / C o m p a n y P h o n e > + 
+             < C o m p a n y P h o n e C a p t i o n > C o m p a n y   P h o n e   C a p t i o n < / C o m p a n y P h o n e C a p t i o n > + 
+             < C o m p a n y F a x N o > C o m p a n y   F a x   N o . < / C o m p a n y F a x N o > + 
+             < C o m p a n y F a x N o C a p t i o n > C o m p a n y   F a x   N o .   C a p t i o n < / C o m p a n y F a x N o C a p t i o n > + 
+             < C o m p a n y E m a i l > C o m p a n y   E m a i l < / C o m p a n y E m a i l > + 
+             < C o m p a n y E m a i l C a p t i o n > C o m p a n y   E m a i l   C a p t i o n < / C o m p a n y E m a i l C a p t i o n > + 
+             < C o m p a n y H o m e P a g e > C o m p a n y   H o m e   P a g e < / C o m p a n y H o m e P a g e > + 
+             < C o m p a n y H o m e P a g e C a p t i o n > C o m p a n y   H o m e   P a g e   C a p t i o n < / C o m p a n y H o m e P a g e C a p t i o n > + 
+             < C o m p a n y L o g o > C o m p a n y   L o g o < / C o m p a n y L o g o > + 
+             < C o m p a n y V A T R e g i s t r a t i o n N o > C o m p a n y   V A T   R e g i s t r a t i o n   N o . < / C o m p a n y V A T R e g i s t r a t i o n N o > + 
+             < C o m p a n y V A T R e g i s t r a t i o n N o C a p t i o n > C o m p a n y   V A T   R e g i s t r a t i o n   N o .   C a p t i o n < / C o m p a n y V A T R e g i s t r a t i o n N o C a p t i o n > + 
+             < C o m p a n y R e g i s t r a t i o n N o > C o m p a n y   R e g i s t r a t i o n   N o . < / C o m p a n y R e g i s t r a t i o n N o > + 
+             < C o m p a n y R e g i s t r a t i o n N o C a p t i o n > C o m p a n y   R e g i s t r a t i o n   N o .   C a p t i o n < / C o m p a n y R e g i s t r a t i o n N o C a p t i o n > + 
+             < C o m p a n y B a n k N a m e > C o m p a n y   B a n k   N a m e < / C o m p a n y B a n k N a m e > + 
+             < C o m p a n y B a n k N a m e C a p t i o n > C o m p a n y   B a n k   N a m e   C a p t i o n < / C o m p a n y B a n k N a m e C a p t i o n > + 
+             < C o m p a n y B a n k A c c o u n t N o > C o m p a n y   B a n k   A c c o u n t   N o . < / C o m p a n y B a n k A c c o u n t N o > + 
+             < C o m p a n y B a n k A c c o u n t N o C a p t i o n > C o m p a n y   B a n k   A c c o u n t   N o .   C a p t i o n < / C o m p a n y B a n k A c c o u n t N o C a p t i o n > + 
+             < C o m p a n y B a n k B r a n c h N o > C o m p a n y   B a n k   B r a n c h   N o . < / C o m p a n y B a n k B r a n c h N o > + 
+             < C o m p a n y B a n k B r a n c h N o C a p t i o n > C o m p a n y   B a n k   B r a n c h   N o .   C a p t i o n < / C o m p a n y B a n k B r a n c h N o C a p t i o n > + 
+             < C o m p a n y I B A N > C o m p a n y   I B A N < / C o m p a n y I B A N > + 
+             < C o m p a n y I B A N C a p t i o n > C o m p a n y   I B A N   C a p t i o n < / C o m p a n y I B A N C a p t i o n > + 
+             < C o m p a n y B a n k S W I F T > C o m p a n y   B a n k   S W I F T < / C o m p a n y B a n k S W I F T > + 
+             < C o m p a n y B a n k S W I F T C a p t i o n > C o m p a n y   B a n k   S W I F T   C a p t i o n < / C o m p a n y B a n k S W I F T C a p t i o n > + 
+             < C o m p a n y G i r o N o > C o m p a n y   G i r o   N o . < / C o m p a n y G i r o N o > + 
+             < C o m p a n y G i r o N o C a p t i o n > C o m p a n y   G i r o   N o .   C a p t i o n < / C o m p a n y G i r o N o C a p t i o n > + 
+         < / C o m p a n y M e t a d a t a > + 
      < / B C R e p o r t I n f o r m a t i o n >   
      < I n t e g e r > @@ -1912,6 +1990,237 @@
          < S a l e s p e r s o n P u r c h a s e r _ J o b _ T i t l e > S a l e s p e r s o n P u r c h a s e r _ J o b _ T i t l e < / S a l e s p e r s o n P u r c h a s e r _ J o b _ T i t l e >   
          < S a l e s p e r s o n P u r c h a s e r _ N a m e > S a l e s p e r s o n P u r c h a s e r _ N a m e < / S a l e s p e r s o n P u r c h a s e r _ N a m e > + 
+     < / I n t e g e r > + 
+ < / N a v W o r d R e p o r t X m l P a r t > 
+</file>
+
+<file path=customXml/item2.xml>��< ? x m l   v e r s i o n = " 1 . 0 "   e n c o d i n g = " u t f - 1 6 " ? > + 
+ < N a v W o r d R e p o r t X m l P a r t   x m l n s = " u r n : m i c r o s o f t - d y n a m i c s - b u s i n e s s c e n t r a l / i n t e r n a l / e x t e n d e d / r e p o r t s / E m a i l _ M e r g e / 5 0 8 4 / " > + 
+     < B C R e p o r t I n f o r m a t i o n > + 
+         < R e p o r t M e t a d a t a > + 
+             < E x t e n s i o n I d > E x t e n s i o n   I D < / E x t e n s i o n I d > + 
+             < E x t e n s i o n N a m e > E x t e n s i o n   N a m e < / E x t e n s i o n N a m e > + 
+             < E x t e n s i o n P u b l i s h e r > E x t e n s i o n   P u b l i s h e r < / E x t e n s i o n P u b l i s h e r > + 
+             < E x t e n s i o n V e r s i o n > E x t e n s i o n   V e r s i o n < / E x t e n s i o n V e r s i o n > + 
+             < R e p o r t I d > R e p o r t   I D < / R e p o r t I d > + 
+             < R e p o r t N a m e > R e p o r t   N a m e < / R e p o r t N a m e > + 
+             < A b o u t T h i s R e p o r t T i t l e > A b o u t   T h i s   R e p o r t   T i t l e < / A b o u t T h i s R e p o r t T i t l e > + 
+             < A b o u t T h i s R e p o r t T e x t > A b o u t   T h i s   R e p o r t   T e x t < / A b o u t T h i s R e p o r t T e x t > + 
+             < R e p o r t H e l p L i n k > R e p o r t   H e l p   L i n k < / R e p o r t H e l p L i n k > + 
+         < / R e p o r t M e t a d a t a > + 
+         < R e p o r t R e q u e s t > + 
+             < T e n a n t E n t r a I d > T e n a n t   E n t r a   I d < / T e n a n t E n t r a I d > + 
+             < E n v i r o n m e n t N a m e > E n v i r o n m e n t   N a m e < / E n v i r o n m e n t N a m e > + 
+             < E n v i r o n m e n t T y p e > E n v i r o n m e n t   T y p e < / E n v i r o n m e n t T y p e > + 
+             < C o m p a n y N a m e > C o m p a n y   N a m e < / C o m p a n y N a m e > + 
+             < C o m p a n y D i s p l a y N a m e > C o m p a n y   D i s p l a y   N a m e < / C o m p a n y D i s p l a y N a m e > + 
+             < C o m p a n y I d > C o m p a n y   I D < / C o m p a n y I d > + 
+             < U s e r N a m e > U s e r   N a m e < / U s e r N a m e > + 
+             < D a t e A n d T i m e > D a t e   a n d   T i m e < / D a t e A n d T i m e > + 
+             < L a n g u a g e > L a n g u a g e < / L a n g u a g e > + 
+             < F o r m a t R e g i o n > F o r m a t   R e g i o n < / F o r m a t R e g i o n > + 
+             < D a t e T i m e V a l u e s > + 
+                 < Y e a r > Y e a r < / Y e a r > + 
+                 < M o n t h N u m b e r > M o n t h   N u m b e r < / M o n t h N u m b e r > + 
+                 < D a y N u m b e r > D a y   N u m b e r < / D a y N u m b e r > + 
+                 < H o u r > H o u r < / H o u r > + 
+                 < M i n u t e > M i n u t e < / M i n u t e > + 
+             < / D a t e T i m e V a l u e s > + 
+         < / R e p o r t R e q u e s t > + 
+         < C o m p a n y M e t a d a t a > + 
+             < C o m p a n y N a m e > C o m p a n y   N a m e < / C o m p a n y N a m e > + 
+             < C o m p a n y D i s p l a y N a m e > C o m p a n y   D i s p l a y   N a m e < / C o m p a n y D i s p l a y N a m e > + 
+             < C o m p a n y A d d r e s s L i n e s > + 
+                 < C o m p a n y A d d r e s s L i n e > C o m p a n y   A d d r e s s   L i n e   1 < / C o m p a n y A d d r e s s L i n e > + 
+                 < C o m p a n y A d d r e s s L i n e > C o m p a n y   A d d r e s s   L i n e   2 < / C o m p a n y A d d r e s s L i n e > + 
+                 < C o m p a n y A d d r e s s L i n e > C o m p a n y   A d d r e s s   L i n e   3 < / C o m p a n y A d d r e s s L i n e > + 
+                 < C o m p a n y A d d r e s s L i n e > C o m p a n y   A d d r e s s   L i n e   4 < / C o m p a n y A d d r e s s L i n e > + 
+                 < C o m p a n y A d d r e s s L i n e > C o m p a n y   A d d r e s s   L i n e   5 < / C o m p a n y A d d r e s s L i n e > + 
+                 < C o m p a n y A d d r e s s L i n e > C o m p a n y   A d d r e s s   L i n e   6 < / C o m p a n y A d d r e s s L i n e > + 
+                 < C o m p a n y A d d r e s s L i n e > C o m p a n y   A d d r e s s   L i n e   7 < / C o m p a n y A d d r e s s L i n e > + 
+                 < C o m p a n y A d d r e s s L i n e > C o m p a n y   A d d r e s s   L i n e   8 < / C o m p a n y A d d r e s s L i n e > + 
+             < / C o m p a n y A d d r e s s L i n e s > + 
+             < C o m p a n y P h o n e > C o m p a n y   P h o n e < / C o m p a n y P h o n e > + 
+             < C o m p a n y P h o n e C a p t i o n > C o m p a n y   P h o n e   C a p t i o n < / C o m p a n y P h o n e C a p t i o n > + 
+             < C o m p a n y F a x N o > C o m p a n y   F a x   N o . < / C o m p a n y F a x N o > + 
+             < C o m p a n y F a x N o C a p t i o n > C o m p a n y   F a x   N o .   C a p t i o n < / C o m p a n y F a x N o C a p t i o n > + 
+             < C o m p a n y E m a i l > C o m p a n y   E m a i l < / C o m p a n y E m a i l > + 
+             < C o m p a n y E m a i l C a p t i o n > C o m p a n y   E m a i l   C a p t i o n < / C o m p a n y E m a i l C a p t i o n > + 
+             < C o m p a n y H o m e P a g e > C o m p a n y   H o m e   P a g e < / C o m p a n y H o m e P a g e > + 
+             < C o m p a n y H o m e P a g e C a p t i o n > C o m p a n y   H o m e   P a g e   C a p t i o n < / C o m p a n y H o m e P a g e C a p t i o n > + 
+             < C o m p a n y L o g o > C o m p a n y   L o g o < / C o m p a n y L o g o > + 
+             < C o m p a n y V A T R e g i s t r a t i o n N o > C o m p a n y   V A T   R e g i s t r a t i o n   N o . < / C o m p a n y V A T R e g i s t r a t i o n N o > + 
+             < C o m p a n y V A T R e g i s t r a t i o n N o C a p t i o n > C o m p a n y   V A T   R e g i s t r a t i o n   N o .   C a p t i o n < / C o m p a n y V A T R e g i s t r a t i o n N o C a p t i o n > + 
+             < C o m p a n y R e g i s t r a t i o n N o > C o m p a n y   R e g i s t r a t i o n   N o . < / C o m p a n y R e g i s t r a t i o n N o > + 
+             < C o m p a n y R e g i s t r a t i o n N o C a p t i o n > C o m p a n y   R e g i s t r a t i o n   N o .   C a p t i o n < / C o m p a n y R e g i s t r a t i o n N o C a p t i o n > + 
+             < C o m p a n y B a n k N a m e > C o m p a n y   B a n k   N a m e < / C o m p a n y B a n k N a m e > + 
+             < C o m p a n y B a n k N a m e C a p t i o n > C o m p a n y   B a n k   N a m e   C a p t i o n < / C o m p a n y B a n k N a m e C a p t i o n > + 
+             < C o m p a n y B a n k A c c o u n t N o > C o m p a n y   B a n k   A c c o u n t   N o . < / C o m p a n y B a n k A c c o u n t N o > + 
+             < C o m p a n y B a n k A c c o u n t N o C a p t i o n > C o m p a n y   B a n k   A c c o u n t   N o .   C a p t i o n < / C o m p a n y B a n k A c c o u n t N o C a p t i o n > + 
+             < C o m p a n y B a n k B r a n c h N o > C o m p a n y   B a n k   B r a n c h   N o . < / C o m p a n y B a n k B r a n c h N o > + 
+             < C o m p a n y B a n k B r a n c h N o C a p t i o n > C o m p a n y   B a n k   B r a n c h   N o .   C a p t i o n < / C o m p a n y B a n k B r a n c h N o C a p t i o n > + 
+             < C o m p a n y I B A N > C o m p a n y   I B A N < / C o m p a n y I B A N > + 
+             < C o m p a n y I B A N C a p t i o n > C o m p a n y   I B A N   C a p t i o n < / C o m p a n y I B A N C a p t i o n > + 
+             < C o m p a n y B a n k S W I F T > C o m p a n y   B a n k   S W I F T < / C o m p a n y B a n k S W I F T > + 
+             < C o m p a n y B a n k S W I F T C a p t i o n > C o m p a n y   B a n k   S W I F T   C a p t i o n < / C o m p a n y B a n k S W I F T C a p t i o n > + 
+             < C o m p a n y G i r o N o > C o m p a n y   G i r o   N o . < / C o m p a n y G i r o N o > + 
+             < C o m p a n y G i r o N o C a p t i o n > C o m p a n y   G i r o   N o .   C a p t i o n < / C o m p a n y G i r o N o C a p t i o n > + 
+         < / C o m p a n y M e t a d a t a > + 
+     < / B C R e p o r t I n f o r m a t i o n > + 
+     < T o o l t i p s > + 
+         < T o o l t i p   c o l u m n = " C o m p a n y _ I n f o r m a t i o n _ P i c t u r e "   E l e m e n t I d = " 8 3 5 3 5 2 0 0 6 " > + 
+             < T o o l t i p T e x t   l a n g = " e n - U S " > S p e c i f i e s   t h e   p i c t u r e   t h a t   h a s   b e e n   s e t   u p   f o r   t h e   c o m p a n y ,   s u c h   a s   a   c o m p a n y   l o g o . < / T o o l t i p T e x t > + 
+         < / T o o l t i p > + 
+         < T o o l t i p   c o l u m n = " C o m p a n y _ I n f o r m a t i o n _ N a m e "   E l e m e n t I d = " 3 1 0 5 7 6 0 0 9 " > + 
+             < T o o l t i p T e x t   l a n g = " e n - U S " > S p e c i f i e s   t h e   c o m p a n y ' s   n a m e   a n d   c o r p o r a t e   f o r m .   F o r   e x a m p l e ,   I n c .   o r   L t d . < / T o o l t i p T e x t > + 
+         < / T o o l t i p > + 
+         < T o o l t i p   c o l u m n = " C o m p a n y _ I n f o r m a t i o n _ A d d r e s s "   E l e m e n t I d = " 8 0 9 9 4 7 6 8 0 " > + 
+             < T o o l t i p T e x t   l a n g = " e n - U S " > S p e c i f i e s   t h e   c o m p a n y ' s   a d d r e s s . < / T o o l t i p T e x t > + 
+         < / T o o l t i p > + 
+         < T o o l t i p   c o l u m n = " C o m p a n y _ I n f o r m a t i o n _ A d d r e s s _ 2 "   E l e m e n t I d = " 2 4 8 5 5 4 4 3 " > + 
+             < T o o l t i p T e x t   l a n g = " e n - U S " > S p e c i f i e s   a d d i t i o n a l   a d d r e s s   i n f o r m a t i o n . < / T o o l t i p T e x t > + 
+         < / T o o l t i p > + 
+         < T o o l t i p   c o l u m n = " C o m p a n y _ I n f o r m a t i o n _ P o s t _ C o d e "   E l e m e n t I d = " 1 7 3 1 9 5 5 0 2 8 " > + 
+             < T o o l t i p T e x t   l a n g = " e n - U S " > S p e c i f i e s   t h e   p o s t a l   c o d e . < / T o o l t i p T e x t > + 
+         < / T o o l t i p > + 
+         < T o o l t i p   c o l u m n = " C o m p a n y _ I n f o r m a t i o n _ C i t y "   E l e m e n t I d = " 1 0 0 2 4 9 4 2 6 5 " > + 
+             < T o o l t i p T e x t   l a n g = " e n - U S " > S p e c i f i e s   t h e   c o m p a n y ' s   c i t y . < / T o o l t i p T e x t > + 
+         < / T o o l t i p > + 
+         < T o o l t i p   c o l u m n = " S a l e s p e r s o n P u r c h a s e r _ N a m e "   E l e m e n t I d = " 1 9 0 9 5 6 4 5 7 " > + 
+             < T o o l t i p T e x t   l a n g = " e n - U S " > S p e c i f i e s   t h e   n a m e   o f   t h e   s a l e s p e r s o n   o r   p u r c h a s e r . < / T o o l t i p T e x t > + 
+         < / T o o l t i p > + 
+         < T o o l t i p   c o l u m n = " S a l e s p e r s o n P u r c h a s e r _ J o b _ T i t l e "   E l e m e n t I d = " 1 9 4 4 9 3 6 3 9 8 " > + 
+             < T o o l t i p T e x t   l a n g = " e n - U S " > S p e c i f i e s   t h e   s a l e s p e r s o n ' s   j o b   t i t l e . < / T o o l t i p T e x t > + 
+         < / T o o l t i p > + 
+     < / T o o l t i p s > + 
+     < I n t e g e r   E l e m e n t T y p e = " D a t a I t e m "   E l e m e n t I d = " 1 7 3 5 6 9 8 6 1 9 " > + 
+         < C o m p a n y _ I n f o r m a t i o n _ A d d r e s s   E l e m e n t T y p e = " C o l u m n "   E l e m e n t I d = " 8 0 9 9 4 7 6 8 0 "   D a t a T y p e = " T e x t " > C o m p a n y _ I n f o r m a t i o n _ A d d r e s s < / C o m p a n y _ I n f o r m a t i o n _ A d d r e s s > + 
+         < C o m p a n y _ I n f o r m a t i o n _ A d d r e s s _ 2   E l e m e n t T y p e = " C o l u m n "   E l e m e n t I d = " 2 4 8 5 5 4 4 3 "   D a t a T y p e = " T e x t " > C o m p a n y _ I n f o r m a t i o n _ A d d r e s s _ 2 < / C o m p a n y _ I n f o r m a t i o n _ A d d r e s s _ 2 > + 
+         < C o m p a n y _ I n f o r m a t i o n _ C i t y   E l e m e n t T y p e = " C o l u m n "   E l e m e n t I d = " 1 0 0 2 4 9 4 2 6 5 "   D a t a T y p e = " T e x t " > C o m p a n y _ I n f o r m a t i o n _ C i t y < / C o m p a n y _ I n f o r m a t i o n _ C i t y > + 
+         < C o m p a n y _ I n f o r m a t i o n _ N a m e   E l e m e n t T y p e = " C o l u m n "   E l e m e n t I d = " 3 1 0 5 7 6 0 0 9 "   D a t a T y p e = " T e x t " > C o m p a n y _ I n f o r m a t i o n _ N a m e < / C o m p a n y _ I n f o r m a t i o n _ N a m e > + 
+         < C o m p a n y _ I n f o r m a t i o n _ P i c t u r e   E l e m e n t T y p e = " C o l u m n "   E l e m e n t I d = " 8 3 5 3 5 2 0 0 6 "   D a t a T y p e = " B l o b "   / > + 
+         < C o m p a n y _ I n f o r m a t i o n _ P o s t _ C o d e   E l e m e n t T y p e = " C o l u m n "   E l e m e n t I d = " 1 7 3 1 9 5 5 0 2 8 "   D a t a T y p e = " C o d e " > C o m p a n y _ I n f o r m a t i o n _ P o s t _ C o d e < / C o m p a n y _ I n f o r m a t i o n _ P o s t _ C o d e > + 
+         < C o n t a c t _ M a i l _ A d d r e s s   E l e m e n t T y p e = " C o l u m n "   E l e m e n t I d = " 7 2 2 4 3 5 0 1 0 "   D a t a T y p e = " T e x t " > C o n t a c t _ M a i l _ A d d r e s s < / C o n t a c t _ M a i l _ A d d r e s s > + 
+         < C o n t e n t   E l e m e n t T y p e = " C o l u m n "   E l e m e n t I d = " 1 8 6 9 8 1 8 0 "   D a t a T y p e = " T e x t " > C o n t e n t < / C o n t e n t > + 
+         < D o c u m e n t _ D a t e   E l e m e n t T y p e = " C o l u m n "   E l e m e n t I d = " 1 9 4 9 1 9 0 9 2 9 "   D a t a T y p e = " T e x t " > D o c u m e n t _ D a t e < / D o c u m e n t _ D a t e > + 
+         < F o r m a l _ S a l u t a t i o n   E l e m e n t T y p e = " C o l u m n "   E l e m e n t I d = " 3 3 5 7 4 7 4 7 7 "   D a t a T y p e = " T e x t " > F o r m a l _ S a l u t a t i o n < / F o r m a l _ S a l u t a t i o n > + 
+         < I n f o r m a l _ S a l u t a t i o n   E l e m e n t T y p e = " C o l u m n "   E l e m e n t I d = " 1 3 0 0 0 5 0 7 4 0 "   D a t a T y p e = " T e x t " > I n f o r m a l _ S a l u t a t i o n < / I n f o r m a l _ S a l u t a t i o n > + 
+         < S a l e s p e r s o n P u r c h a s e r _ J o b _ T i t l e   E l e m e n t T y p e = " C o l u m n "   E l e m e n t I d = " 1 9 4 4 9 3 6 3 9 8 "   D a t a T y p e = " T e x t " > S a l e s p e r s o n P u r c h a s e r _ J o b _ T i t l e < / S a l e s p e r s o n P u r c h a s e r _ J o b _ T i t l e > + 
+         < S a l e s p e r s o n P u r c h a s e r _ N a m e   E l e m e n t T y p e = " C o l u m n "   E l e m e n t I d = " 1 9 0 9 5 6 4 5 7 "   D a t a T y p e = " T e x t " > S a l e s p e r s o n P u r c h a s e r _ N a m e < / S a l e s p e r s o n P u r c h a s e r _ N a m e >   
      < / I n t e g e r >   

</xml_diff>

<commit_message>
Subtype Body is now available
</commit_message>
<xml_diff>
--- a/src/Layers/W1/BaseApp/CRM/DefaultEmailMergeDoc.docx
+++ b/src/Layers/W1/BaseApp/CRM/DefaultEmailMergeDoc.docx
@@ -1837,6 +1837,8 @@
  
              < R e p o r t N a m e > R e p o r t   N a m e < / R e p o r t N a m e >   
+             < R e p o r t C a p t i o n > R e p o r t   C a p t i o n < / R e p o r t C a p t i o n > + 
              < A b o u t T h i s R e p o r t T i t l e > A b o u t   T h i s   R e p o r t   T i t l e < / A b o u t T h i s R e p o r t T i t l e >   
              < A b o u t T h i s R e p o r t T e x t > A b o u t   T h i s   R e p o r t   T e x t < / A b o u t T h i s R e p o r t T e x t > @@ -1883,6 +1885,84 @@
  
          < / R e p o r t R e q u e s t >   
+         < C o m p a n y M e t a d a t a > + 
+             < C o m p a n y N a m e > C o m p a n y   N a m e < / C o m p a n y N a m e > + 
+             < C o m p a n y D i s p l a y N a m e > C o m p a n y   D i s p l a y   N a m e < / C o m p a n y D i s p l a y N a m e > + 
+             < C o m p a n y A d d r e s s L i n e s > + 
+                 < C o m p a n y A d d r e s s L i n e 1 > C o m p a n y   A d d r e s s   L i n e   1 < / C o m p a n y A d d r e s s L i n e 1 > + 
+                 < C o m p a n y A d d r e s s L i n e 2 > C o m p a n y   A d d r e s s   L i n e   2 < / C o m p a n y A d d r e s s L i n e 2 > + 
+                 < C o m p a n y A d d r e s s L i n e 3 > C o m p a n y   A d d r e s s   L i n e   3 < / C o m p a n y A d d r e s s L i n e 3 > + 
+                 < C o m p a n y A d d r e s s L i n e 4 > C o m p a n y   A d d r e s s   L i n e   4 < / C o m p a n y A d d r e s s L i n e 4 > + 
+                 < C o m p a n y A d d r e s s L i n e 5 > C o m p a n y   A d d r e s s   L i n e   5 < / C o m p a n y A d d r e s s L i n e 5 > + 
+                 < C o m p a n y A d d r e s s L i n e 6 > C o m p a n y   A d d r e s s   L i n e   6 < / C o m p a n y A d d r e s s L i n e 6 > + 
+                 < C o m p a n y A d d r e s s L i n e 7 > C o m p a n y   A d d r e s s   L i n e   7 < / C o m p a n y A d d r e s s L i n e 7 > + 
+                 < C o m p a n y A d d r e s s L i n e 8 > C o m p a n y   A d d r e s s   L i n e   8 < / C o m p a n y A d d r e s s L i n e 8 > + 
+             < / C o m p a n y A d d r e s s L i n e s > + 
+             < C o m p a n y P h o n e > C o m p a n y   P h o n e < / C o m p a n y P h o n e > + 
+             < C o m p a n y P h o n e C a p t i o n > C o m p a n y   P h o n e   C a p t i o n < / C o m p a n y P h o n e C a p t i o n > + 
+             < C o m p a n y F a x N o > C o m p a n y   F a x   N o . < / C o m p a n y F a x N o > + 
+             < C o m p a n y F a x N o C a p t i o n > C o m p a n y   F a x   N o .   C a p t i o n < / C o m p a n y F a x N o C a p t i o n > + 
+             < C o m p a n y E m a i l > C o m p a n y   E m a i l < / C o m p a n y E m a i l > + 
+             < C o m p a n y E m a i l C a p t i o n > C o m p a n y   E m a i l   C a p t i o n < / C o m p a n y E m a i l C a p t i o n > + 
+             < C o m p a n y H o m e P a g e > C o m p a n y   H o m e   P a g e < / C o m p a n y H o m e P a g e > + 
+             < C o m p a n y H o m e P a g e C a p t i o n > C o m p a n y   H o m e   P a g e   C a p t i o n < / C o m p a n y H o m e P a g e C a p t i o n > + 
+             < C o m p a n y L o g o > C o m p a n y   L o g o < / C o m p a n y L o g o > + 
+             < C o m p a n y V A T R e g i s t r a t i o n N o > C o m p a n y   V A T   R e g i s t r a t i o n   N o . < / C o m p a n y V A T R e g i s t r a t i o n N o > + 
+             < C o m p a n y V A T R e g i s t r a t i o n N o C a p t i o n > C o m p a n y   V A T   R e g i s t r a t i o n   N o .   C a p t i o n < / C o m p a n y V A T R e g i s t r a t i o n N o C a p t i o n > + 
+             < C o m p a n y R e g i s t r a t i o n N o > C o m p a n y   R e g i s t r a t i o n   N o . < / C o m p a n y R e g i s t r a t i o n N o > + 
+             < C o m p a n y R e g i s t r a t i o n N o C a p t i o n > C o m p a n y   R e g i s t r a t i o n   N o .   C a p t i o n < / C o m p a n y R e g i s t r a t i o n N o C a p t i o n > + 
+             < C o m p a n y B a n k N a m e > C o m p a n y   B a n k   N a m e < / C o m p a n y B a n k N a m e > + 
+             < C o m p a n y B a n k N a m e C a p t i o n > C o m p a n y   B a n k   N a m e   C a p t i o n < / C o m p a n y B a n k N a m e C a p t i o n > + 
+             < C o m p a n y B a n k A c c o u n t N o > C o m p a n y   B a n k   A c c o u n t   N o . < / C o m p a n y B a n k A c c o u n t N o > + 
+             < C o m p a n y B a n k A c c o u n t N o C a p t i o n > C o m p a n y   B a n k   A c c o u n t   N o .   C a p t i o n < / C o m p a n y B a n k A c c o u n t N o C a p t i o n > + 
+             < C o m p a n y B a n k B r a n c h N o > C o m p a n y   B a n k   B r a n c h   N o . < / C o m p a n y B a n k B r a n c h N o > + 
+             < C o m p a n y B a n k B r a n c h N o C a p t i o n > C o m p a n y   B a n k   B r a n c h   N o .   C a p t i o n < / C o m p a n y B a n k B r a n c h N o C a p t i o n > + 
+             < C o m p a n y I B A N > C o m p a n y   I B A N < / C o m p a n y I B A N > + 
+             < C o m p a n y I B A N C a p t i o n > C o m p a n y   I B A N   C a p t i o n < / C o m p a n y I B A N C a p t i o n > + 
+             < C o m p a n y B a n k S W I F T > C o m p a n y   B a n k   S W I F T < / C o m p a n y B a n k S W I F T > + 
+             < C o m p a n y B a n k S W I F T C a p t i o n > C o m p a n y   B a n k   S W I F T   C a p t i o n < / C o m p a n y B a n k S W I F T C a p t i o n > + 
+             < C o m p a n y G i r o N o > C o m p a n y   G i r o   N o . < / C o m p a n y G i r o N o > + 
+             < C o m p a n y G i r o N o C a p t i o n > C o m p a n y   G i r o   N o .   C a p t i o n < / C o m p a n y G i r o N o C a p t i o n > + 
+         < / C o m p a n y M e t a d a t a > + 
      < / B C R e p o r t I n f o r m a t i o n >   
      < I n t e g e r > @@ -1912,6 +1992,239 @@
          < S a l e s p e r s o n P u r c h a s e r _ J o b _ T i t l e > S a l e s p e r s o n P u r c h a s e r _ J o b _ T i t l e < / S a l e s p e r s o n P u r c h a s e r _ J o b _ T i t l e >   
          < S a l e s p e r s o n P u r c h a s e r _ N a m e > S a l e s p e r s o n P u r c h a s e r _ N a m e < / S a l e s p e r s o n P u r c h a s e r _ N a m e > + 
+     < / I n t e g e r > + 
+ < / N a v W o r d R e p o r t X m l P a r t > 
+</file>
+
+<file path=customXml/item2.xml>��< ? x m l   v e r s i o n = " 1 . 0 "   e n c o d i n g = " u t f - 1 6 " ? > + 
+ < N a v W o r d R e p o r t X m l P a r t   x m l n s = " u r n : m i c r o s o f t - d y n a m i c s - b u s i n e s s c e n t r a l / i n t e r n a l / e x t e n d e d / r e p o r t s / E m a i l _ M e r g e / 5 0 8 4 / " > + 
+     < B C R e p o r t I n f o r m a t i o n > + 
+         < R e p o r t M e t a d a t a > + 
+             < E x t e n s i o n I d > E x t e n s i o n   I D < / E x t e n s i o n I d > + 
+             < E x t e n s i o n N a m e > E x t e n s i o n   N a m e < / E x t e n s i o n N a m e > + 
+             < E x t e n s i o n P u b l i s h e r > E x t e n s i o n   P u b l i s h e r < / E x t e n s i o n P u b l i s h e r > + 
+             < E x t e n s i o n V e r s i o n > E x t e n s i o n   V e r s i o n < / E x t e n s i o n V e r s i o n > + 
+             < R e p o r t I d > R e p o r t   I D < / R e p o r t I d > + 
+             < R e p o r t N a m e > R e p o r t   N a m e < / R e p o r t N a m e > + 
+             < R e p o r t C a p t i o n > R e p o r t   C a p t i o n < / R e p o r t C a p t i o n > + 
+             < A b o u t T h i s R e p o r t T i t l e > A b o u t   T h i s   R e p o r t   T i t l e < / A b o u t T h i s R e p o r t T i t l e > + 
+             < A b o u t T h i s R e p o r t T e x t > A b o u t   T h i s   R e p o r t   T e x t < / A b o u t T h i s R e p o r t T e x t > + 
+             < R e p o r t H e l p L i n k > R e p o r t   H e l p   L i n k < / R e p o r t H e l p L i n k > + 
+         < / R e p o r t M e t a d a t a > + 
+         < R e p o r t R e q u e s t > + 
+             < T e n a n t E n t r a I d > T e n a n t   E n t r a   I d < / T e n a n t E n t r a I d > + 
+             < E n v i r o n m e n t N a m e > E n v i r o n m e n t   N a m e < / E n v i r o n m e n t N a m e > + 
+             < E n v i r o n m e n t T y p e > E n v i r o n m e n t   T y p e < / E n v i r o n m e n t T y p e > + 
+             < C o m p a n y N a m e > C o m p a n y   N a m e < / C o m p a n y N a m e > + 
+             < C o m p a n y D i s p l a y N a m e > C o m p a n y   D i s p l a y   N a m e < / C o m p a n y D i s p l a y N a m e > + 
+             < C o m p a n y I d > C o m p a n y   I D < / C o m p a n y I d > + 
+             < U s e r N a m e > U s e r   N a m e < / U s e r N a m e > + 
+             < D a t e A n d T i m e > D a t e   a n d   T i m e < / D a t e A n d T i m e > + 
+             < L a n g u a g e > L a n g u a g e < / L a n g u a g e > + 
+             < F o r m a t R e g i o n > F o r m a t   R e g i o n < / F o r m a t R e g i o n > + 
+             < D a t e T i m e V a l u e s > + 
+                 < Y e a r > Y e a r < / Y e a r > + 
+                 < M o n t h N u m b e r > M o n t h   N u m b e r < / M o n t h N u m b e r > + 
+                 < D a y N u m b e r > D a y   N u m b e r < / D a y N u m b e r > + 
+                 < H o u r > H o u r < / H o u r > + 
+                 < M i n u t e > M i n u t e < / M i n u t e > + 
+             < / D a t e T i m e V a l u e s > + 
+         < / R e p o r t R e q u e s t > + 
+         < C o m p a n y M e t a d a t a > + 
+             < C o m p a n y N a m e > C o m p a n y   N a m e < / C o m p a n y N a m e > + 
+             < C o m p a n y D i s p l a y N a m e > C o m p a n y   D i s p l a y   N a m e < / C o m p a n y D i s p l a y N a m e > + 
+             < C o m p a n y A d d r e s s L i n e s > + 
+                 < C o m p a n y A d d r e s s L i n e 1 > C o m p a n y   A d d r e s s   L i n e   1 < / C o m p a n y A d d r e s s L i n e 1 > + 
+                 < C o m p a n y A d d r e s s L i n e 2 > C o m p a n y   A d d r e s s   L i n e   2 < / C o m p a n y A d d r e s s L i n e 2 > + 
+                 < C o m p a n y A d d r e s s L i n e 3 > C o m p a n y   A d d r e s s   L i n e   3 < / C o m p a n y A d d r e s s L i n e 3 > + 
+                 < C o m p a n y A d d r e s s L i n e 4 > C o m p a n y   A d d r e s s   L i n e   4 < / C o m p a n y A d d r e s s L i n e 4 > + 
+                 < C o m p a n y A d d r e s s L i n e 5 > C o m p a n y   A d d r e s s   L i n e   5 < / C o m p a n y A d d r e s s L i n e 5 > + 
+                 < C o m p a n y A d d r e s s L i n e 6 > C o m p a n y   A d d r e s s   L i n e   6 < / C o m p a n y A d d r e s s L i n e 6 > + 
+                 < C o m p a n y A d d r e s s L i n e 7 > C o m p a n y   A d d r e s s   L i n e   7 < / C o m p a n y A d d r e s s L i n e 7 > + 
+                 < C o m p a n y A d d r e s s L i n e 8 > C o m p a n y   A d d r e s s   L i n e   8 < / C o m p a n y A d d r e s s L i n e 8 > + 
+             < / C o m p a n y A d d r e s s L i n e s > + 
+             < C o m p a n y P h o n e > C o m p a n y   P h o n e < / C o m p a n y P h o n e > + 
+             < C o m p a n y P h o n e C a p t i o n > C o m p a n y   P h o n e   C a p t i o n < / C o m p a n y P h o n e C a p t i o n > + 
+             < C o m p a n y F a x N o > C o m p a n y   F a x   N o . < / C o m p a n y F a x N o > + 
+             < C o m p a n y F a x N o C a p t i o n > C o m p a n y   F a x   N o .   C a p t i o n < / C o m p a n y F a x N o C a p t i o n > + 
+             < C o m p a n y E m a i l > C o m p a n y   E m a i l < / C o m p a n y E m a i l > + 
+             < C o m p a n y E m a i l C a p t i o n > C o m p a n y   E m a i l   C a p t i o n < / C o m p a n y E m a i l C a p t i o n > + 
+             < C o m p a n y H o m e P a g e > C o m p a n y   H o m e   P a g e < / C o m p a n y H o m e P a g e > + 
+             < C o m p a n y H o m e P a g e C a p t i o n > C o m p a n y   H o m e   P a g e   C a p t i o n < / C o m p a n y H o m e P a g e C a p t i o n > + 
+             < C o m p a n y L o g o > C o m p a n y   L o g o < / C o m p a n y L o g o > + 
+             < C o m p a n y V A T R e g i s t r a t i o n N o > C o m p a n y   V A T   R e g i s t r a t i o n   N o . < / C o m p a n y V A T R e g i s t r a t i o n N o > + 
+             < C o m p a n y V A T R e g i s t r a t i o n N o C a p t i o n > C o m p a n y   V A T   R e g i s t r a t i o n   N o .   C a p t i o n < / C o m p a n y V A T R e g i s t r a t i o n N o C a p t i o n > + 
+             < C o m p a n y R e g i s t r a t i o n N o > C o m p a n y   R e g i s t r a t i o n   N o . < / C o m p a n y R e g i s t r a t i o n N o > + 
+             < C o m p a n y R e g i s t r a t i o n N o C a p t i o n > C o m p a n y   R e g i s t r a t i o n   N o .   C a p t i o n < / C o m p a n y R e g i s t r a t i o n N o C a p t i o n > + 
+             < C o m p a n y B a n k N a m e > C o m p a n y   B a n k   N a m e < / C o m p a n y B a n k N a m e > + 
+             < C o m p a n y B a n k N a m e C a p t i o n > C o m p a n y   B a n k   N a m e   C a p t i o n < / C o m p a n y B a n k N a m e C a p t i o n > + 
+             < C o m p a n y B a n k A c c o u n t N o > C o m p a n y   B a n k   A c c o u n t   N o . < / C o m p a n y B a n k A c c o u n t N o > + 
+             < C o m p a n y B a n k A c c o u n t N o C a p t i o n > C o m p a n y   B a n k   A c c o u n t   N o .   C a p t i o n < / C o m p a n y B a n k A c c o u n t N o C a p t i o n > + 
+             < C o m p a n y B a n k B r a n c h N o > C o m p a n y   B a n k   B r a n c h   N o . < / C o m p a n y B a n k B r a n c h N o > + 
+             < C o m p a n y B a n k B r a n c h N o C a p t i o n > C o m p a n y   B a n k   B r a n c h   N o .   C a p t i o n < / C o m p a n y B a n k B r a n c h N o C a p t i o n > + 
+             < C o m p a n y I B A N > C o m p a n y   I B A N < / C o m p a n y I B A N > + 
+             < C o m p a n y I B A N C a p t i o n > C o m p a n y   I B A N   C a p t i o n < / C o m p a n y I B A N C a p t i o n > + 
+             < C o m p a n y B a n k S W I F T > C o m p a n y   B a n k   S W I F T < / C o m p a n y B a n k S W I F T > + 
+             < C o m p a n y B a n k S W I F T C a p t i o n > C o m p a n y   B a n k   S W I F T   C a p t i o n < / C o m p a n y B a n k S W I F T C a p t i o n > + 
+             < C o m p a n y G i r o N o > C o m p a n y   G i r o   N o . < / C o m p a n y G i r o N o > + 
+             < C o m p a n y G i r o N o C a p t i o n > C o m p a n y   G i r o   N o .   C a p t i o n < / C o m p a n y G i r o N o C a p t i o n > + 
+         < / C o m p a n y M e t a d a t a > + 
+     < / B C R e p o r t I n f o r m a t i o n > + 
+     < T o o l t i p s > + 
+         < T o o l t i p   c o l u m n = " C o m p a n y _ I n f o r m a t i o n _ P i c t u r e "   E l e m e n t I d = " 8 3 5 3 5 2 0 0 6 " > + 
+             < T o o l t i p T e x t   l a n g = " e n - U S " > S p e c i f i e s   t h e   p i c t u r e   t h a t   h a s   b e e n   s e t   u p   f o r   t h e   c o m p a n y ,   s u c h   a s   a   c o m p a n y   l o g o . < / T o o l t i p T e x t > + 
+         < / T o o l t i p > + 
+         < T o o l t i p   c o l u m n = " C o m p a n y _ I n f o r m a t i o n _ N a m e "   E l e m e n t I d = " 3 1 0 5 7 6 0 0 9 " > + 
+             < T o o l t i p T e x t   l a n g = " e n - U S " > S p e c i f i e s   t h e   c o m p a n y ' s   n a m e   a n d   c o r p o r a t e   f o r m .   F o r   e x a m p l e ,   I n c .   o r   L t d . < / T o o l t i p T e x t > + 
+         < / T o o l t i p > + 
+         < T o o l t i p   c o l u m n = " C o m p a n y _ I n f o r m a t i o n _ A d d r e s s "   E l e m e n t I d = " 8 0 9 9 4 7 6 8 0 " > + 
+             < T o o l t i p T e x t   l a n g = " e n - U S " > S p e c i f i e s   t h e   c o m p a n y ' s   a d d r e s s . < / T o o l t i p T e x t > + 
+         < / T o o l t i p > + 
+         < T o o l t i p   c o l u m n = " C o m p a n y _ I n f o r m a t i o n _ A d d r e s s _ 2 "   E l e m e n t I d = " 2 4 8 5 5 4 4 3 " > + 
+             < T o o l t i p T e x t   l a n g = " e n - U S " > S p e c i f i e s   a d d i t i o n a l   a d d r e s s   i n f o r m a t i o n . < / T o o l t i p T e x t > + 
+         < / T o o l t i p > + 
+         < T o o l t i p   c o l u m n = " C o m p a n y _ I n f o r m a t i o n _ P o s t _ C o d e "   E l e m e n t I d = " 1 7 3 1 9 5 5 0 2 8 " > + 
+             < T o o l t i p T e x t   l a n g = " e n - U S " > S p e c i f i e s   t h e   p o s t a l   c o d e . < / T o o l t i p T e x t > + 
+         < / T o o l t i p > + 
+         < T o o l t i p   c o l u m n = " C o m p a n y _ I n f o r m a t i o n _ C i t y "   E l e m e n t I d = " 1 0 0 2 4 9 4 2 6 5 " > + 
+             < T o o l t i p T e x t   l a n g = " e n - U S " > S p e c i f i e s   t h e   c o m p a n y ' s   c i t y . < / T o o l t i p T e x t > + 
+         < / T o o l t i p > + 
+         < T o o l t i p   c o l u m n = " S a l e s p e r s o n P u r c h a s e r _ N a m e "   E l e m e n t I d = " 1 9 0 9 5 6 4 5 7 " > + 
+             < T o o l t i p T e x t   l a n g = " e n - U S " > S p e c i f i e s   t h e   n a m e   o f   t h e   s a l e s p e r s o n   o r   p u r c h a s e r . < / T o o l t i p T e x t > + 
+         < / T o o l t i p > + 
+         < T o o l t i p   c o l u m n = " S a l e s p e r s o n P u r c h a s e r _ J o b _ T i t l e "   E l e m e n t I d = " 1 9 4 4 9 3 6 3 9 8 " > + 
+             < T o o l t i p T e x t   l a n g = " e n - U S " > S p e c i f i e s   t h e   s a l e s p e r s o n ' s   j o b   t i t l e . < / T o o l t i p T e x t > + 
+         < / T o o l t i p > + 
+     < / T o o l t i p s > + 
+     < I n t e g e r   E l e m e n t T y p e = " D a t a I t e m "   E l e m e n t I d = " 1 7 3 5 6 9 8 6 1 9 " > + 
+         < C o m p a n y _ I n f o r m a t i o n _ A d d r e s s   E l e m e n t T y p e = " C o l u m n "   E l e m e n t I d = " 8 0 9 9 4 7 6 8 0 "   D a t a T y p e = " T e x t " > C o m p a n y _ I n f o r m a t i o n _ A d d r e s s < / C o m p a n y _ I n f o r m a t i o n _ A d d r e s s > + 
+         < C o m p a n y _ I n f o r m a t i o n _ A d d r e s s _ 2   E l e m e n t T y p e = " C o l u m n "   E l e m e n t I d = " 2 4 8 5 5 4 4 3 "   D a t a T y p e = " T e x t " > C o m p a n y _ I n f o r m a t i o n _ A d d r e s s _ 2 < / C o m p a n y _ I n f o r m a t i o n _ A d d r e s s _ 2 > + 
+         < C o m p a n y _ I n f o r m a t i o n _ C i t y   E l e m e n t T y p e = " C o l u m n "   E l e m e n t I d = " 1 0 0 2 4 9 4 2 6 5 "   D a t a T y p e = " T e x t " > C o m p a n y _ I n f o r m a t i o n _ C i t y < / C o m p a n y _ I n f o r m a t i o n _ C i t y > + 
+         < C o m p a n y _ I n f o r m a t i o n _ N a m e   E l e m e n t T y p e = " C o l u m n "   E l e m e n t I d = " 3 1 0 5 7 6 0 0 9 "   D a t a T y p e = " T e x t " > C o m p a n y _ I n f o r m a t i o n _ N a m e < / C o m p a n y _ I n f o r m a t i o n _ N a m e > + 
+         < C o m p a n y _ I n f o r m a t i o n _ P i c t u r e   E l e m e n t T y p e = " C o l u m n "   E l e m e n t I d = " 8 3 5 3 5 2 0 0 6 "   D a t a T y p e = " B l o b "   / > + 
+         < C o m p a n y _ I n f o r m a t i o n _ P o s t _ C o d e   E l e m e n t T y p e = " C o l u m n "   E l e m e n t I d = " 1 7 3 1 9 5 5 0 2 8 "   D a t a T y p e = " C o d e " > C o m p a n y _ I n f o r m a t i o n _ P o s t _ C o d e < / C o m p a n y _ I n f o r m a t i o n _ P o s t _ C o d e > + 
+         < C o n t a c t _ M a i l _ A d d r e s s   E l e m e n t T y p e = " C o l u m n "   E l e m e n t I d = " 7 2 2 4 3 5 0 1 0 "   D a t a T y p e = " T e x t " > C o n t a c t _ M a i l _ A d d r e s s < / C o n t a c t _ M a i l _ A d d r e s s > + 
+         < C o n t e n t   E l e m e n t T y p e = " C o l u m n "   E l e m e n t I d = " 1 8 6 9 8 1 8 0 "   D a t a T y p e = " T e x t " > C o n t e n t < / C o n t e n t > + 
+         < D o c u m e n t _ D a t e   E l e m e n t T y p e = " C o l u m n "   E l e m e n t I d = " 1 9 4 9 1 9 0 9 2 9 "   D a t a T y p e = " T e x t " > D o c u m e n t _ D a t e < / D o c u m e n t _ D a t e > + 
+         < F o r m a l _ S a l u t a t i o n   E l e m e n t T y p e = " C o l u m n "   E l e m e n t I d = " 3 3 5 7 4 7 4 7 7 "   D a t a T y p e = " T e x t " > F o r m a l _ S a l u t a t i o n < / F o r m a l _ S a l u t a t i o n > + 
+         < I n f o r m a l _ S a l u t a t i o n   E l e m e n t T y p e = " C o l u m n "   E l e m e n t I d = " 1 3 0 0 0 5 0 7 4 0 "   D a t a T y p e = " T e x t " > I n f o r m a l _ S a l u t a t i o n < / I n f o r m a l _ S a l u t a t i o n > + 
+         < S a l e s p e r s o n P u r c h a s e r _ J o b _ T i t l e   E l e m e n t T y p e = " C o l u m n "   E l e m e n t I d = " 1 9 4 4 9 3 6 3 9 8 "   D a t a T y p e = " T e x t " > S a l e s p e r s o n P u r c h a s e r _ J o b _ T i t l e < / S a l e s p e r s o n P u r c h a s e r _ J o b _ T i t l e > + 
+         < S a l e s p e r s o n P u r c h a s e r _ N a m e   E l e m e n t T y p e = " C o l u m n "   E l e m e n t I d = " 1 9 0 9 5 6 4 5 7 "   D a t a T y p e = " T e x t " > S a l e s p e r s o n P u r c h a s e r _ N a m e < / S a l e s p e r s o n P u r c h a s e r _ N a m e >   
      < / I n t e g e r >   

</xml_diff>

<commit_message>
Reset old Word layouts to main
The pre-existing .docx layouts were re-saved while the body-only layouts were
being authored, so they showed up in the pull request without carrying a real
change: in most of them only customXml/* and word/_rels/document.xml.rels
differ, not word/document.xml. Restore all 66 of them to the state of the main
snapshot merged into this branch (4f11a9b205).

The branch now touches only the new *Body.docx layouts and the reusable
header/footer and theme designs under .resources/ReportParts, which the
composite layout seeding reads as app resources.

Co-Authored-By: Claude Opus 5 <noreply@anthropic.com>
</commit_message>
<xml_diff>
--- a/src/Layers/W1/BaseApp/CRM/DefaultEmailMergeDoc.docx
+++ b/src/Layers/W1/BaseApp/CRM/DefaultEmailMergeDoc.docx
@@ -1837,8 +1837,6 @@
  
              < R e p o r t N a m e > R e p o r t   N a m e < / R e p o r t N a m e >   
-             < R e p o r t C a p t i o n > R e p o r t   C a p t i o n < / R e p o r t C a p t i o n > - 
              < A b o u t T h i s R e p o r t T i t l e > A b o u t   T h i s   R e p o r t   T i t l e < / A b o u t T h i s R e p o r t T i t l e >   
              < A b o u t T h i s R e p o r t T e x t > A b o u t   T h i s   R e p o r t   T e x t < / A b o u t T h i s R e p o r t T e x t > @@ -1885,84 +1883,6 @@
  
          < / R e p o r t R e q u e s t >   
-         < C o m p a n y M e t a d a t a > - 
-             < C o m p a n y N a m e > C o m p a n y   N a m e < / C o m p a n y N a m e > - 
-             < C o m p a n y D i s p l a y N a m e > C o m p a n y   D i s p l a y   N a m e < / C o m p a n y D i s p l a y N a m e > - 
-             < C o m p a n y A d d r e s s L i n e s > - 
-                 < C o m p a n y A d d r e s s L i n e 1 > C o m p a n y   A d d r e s s   L i n e   1 < / C o m p a n y A d d r e s s L i n e 1 > - 
-                 < C o m p a n y A d d r e s s L i n e 2 > C o m p a n y   A d d r e s s   L i n e   2 < / C o m p a n y A d d r e s s L i n e 2 > - 
-                 < C o m p a n y A d d r e s s L i n e 3 > C o m p a n y   A d d r e s s   L i n e   3 < / C o m p a n y A d d r e s s L i n e 3 > - 
-                 < C o m p a n y A d d r e s s L i n e 4 > C o m p a n y   A d d r e s s   L i n e   4 < / C o m p a n y A d d r e s s L i n e 4 > - 
-                 < C o m p a n y A d d r e s s L i n e 5 > C o m p a n y   A d d r e s s   L i n e   5 < / C o m p a n y A d d r e s s L i n e 5 > - 
-                 < C o m p a n y A d d r e s s L i n e 6 > C o m p a n y   A d d r e s s   L i n e   6 < / C o m p a n y A d d r e s s L i n e 6 > - 
-                 < C o m p a n y A d d r e s s L i n e 7 > C o m p a n y   A d d r e s s   L i n e   7 < / C o m p a n y A d d r e s s L i n e 7 > - 
-                 < C o m p a n y A d d r e s s L i n e 8 > C o m p a n y   A d d r e s s   L i n e   8 < / C o m p a n y A d d r e s s L i n e 8 > - 
-             < / C o m p a n y A d d r e s s L i n e s > - 
-             < C o m p a n y P h o n e > C o m p a n y   P h o n e < / C o m p a n y P h o n e > - 
-             < C o m p a n y P h o n e C a p t i o n > C o m p a n y   P h o n e   C a p t i o n < / C o m p a n y P h o n e C a p t i o n > - 
-             < C o m p a n y F a x N o > C o m p a n y   F a x   N o . < / C o m p a n y F a x N o > - 
-             < C o m p a n y F a x N o C a p t i o n > C o m p a n y   F a x   N o .   C a p t i o n < / C o m p a n y F a x N o C a p t i o n > - 
-             < C o m p a n y E m a i l > C o m p a n y   E m a i l < / C o m p a n y E m a i l > - 
-             < C o m p a n y E m a i l C a p t i o n > C o m p a n y   E m a i l   C a p t i o n < / C o m p a n y E m a i l C a p t i o n > - 
-             < C o m p a n y H o m e P a g e > C o m p a n y   H o m e   P a g e < / C o m p a n y H o m e P a g e > - 
-             < C o m p a n y H o m e P a g e C a p t i o n > C o m p a n y   H o m e   P a g e   C a p t i o n < / C o m p a n y H o m e P a g e C a p t i o n > - 
-             < C o m p a n y L o g o > C o m p a n y   L o g o < / C o m p a n y L o g o > - 
-             < C o m p a n y V A T R e g i s t r a t i o n N o > C o m p a n y   V A T   R e g i s t r a t i o n   N o . < / C o m p a n y V A T R e g i s t r a t i o n N o > - 
-             < C o m p a n y V A T R e g i s t r a t i o n N o C a p t i o n > C o m p a n y   V A T   R e g i s t r a t i o n   N o .   C a p t i o n < / C o m p a n y V A T R e g i s t r a t i o n N o C a p t i o n > - 
-             < C o m p a n y R e g i s t r a t i o n N o > C o m p a n y   R e g i s t r a t i o n   N o . < / C o m p a n y R e g i s t r a t i o n N o > - 
-             < C o m p a n y R e g i s t r a t i o n N o C a p t i o n > C o m p a n y   R e g i s t r a t i o n   N o .   C a p t i o n < / C o m p a n y R e g i s t r a t i o n N o C a p t i o n > - 
-             < C o m p a n y B a n k N a m e > C o m p a n y   B a n k   N a m e < / C o m p a n y B a n k N a m e > - 
-             < C o m p a n y B a n k N a m e C a p t i o n > C o m p a n y   B a n k   N a m e   C a p t i o n < / C o m p a n y B a n k N a m e C a p t i o n > - 
-             < C o m p a n y B a n k A c c o u n t N o > C o m p a n y   B a n k   A c c o u n t   N o . < / C o m p a n y B a n k A c c o u n t N o > - 
-             < C o m p a n y B a n k A c c o u n t N o C a p t i o n > C o m p a n y   B a n k   A c c o u n t   N o .   C a p t i o n < / C o m p a n y B a n k A c c o u n t N o C a p t i o n > - 
-             < C o m p a n y B a n k B r a n c h N o > C o m p a n y   B a n k   B r a n c h   N o . < / C o m p a n y B a n k B r a n c h N o > - 
-             < C o m p a n y B a n k B r a n c h N o C a p t i o n > C o m p a n y   B a n k   B r a n c h   N o .   C a p t i o n < / C o m p a n y B a n k B r a n c h N o C a p t i o n > - 
-             < C o m p a n y I B A N > C o m p a n y   I B A N < / C o m p a n y I B A N > - 
-             < C o m p a n y I B A N C a p t i o n > C o m p a n y   I B A N   C a p t i o n < / C o m p a n y I B A N C a p t i o n > - 
-             < C o m p a n y B a n k S W I F T > C o m p a n y   B a n k   S W I F T < / C o m p a n y B a n k S W I F T > - 
-             < C o m p a n y B a n k S W I F T C a p t i o n > C o m p a n y   B a n k   S W I F T   C a p t i o n < / C o m p a n y B a n k S W I F T C a p t i o n > - 
-             < C o m p a n y G i r o N o > C o m p a n y   G i r o   N o . < / C o m p a n y G i r o N o > - 
-             < C o m p a n y G i r o N o C a p t i o n > C o m p a n y   G i r o   N o .   C a p t i o n < / C o m p a n y G i r o N o C a p t i o n > - 
-         < / C o m p a n y M e t a d a t a > - 
      < / B C R e p o r t I n f o r m a t i o n >   
      < I n t e g e r > @@ -1992,239 +1912,6 @@
          < S a l e s p e r s o n P u r c h a s e r _ J o b _ T i t l e > S a l e s p e r s o n P u r c h a s e r _ J o b _ T i t l e < / S a l e s p e r s o n P u r c h a s e r _ J o b _ T i t l e >   
          < S a l e s p e r s o n P u r c h a s e r _ N a m e > S a l e s p e r s o n P u r c h a s e r _ N a m e < / S a l e s p e r s o n P u r c h a s e r _ N a m e > - 
-     < / I n t e g e r > - 
- < / N a v W o r d R e p o r t X m l P a r t > 
-</file>
-
-<file path=customXml/item2.xml>��< ? x m l   v e r s i o n = " 1 . 0 "   e n c o d i n g = " u t f - 1 6 " ? > - 
- < N a v W o r d R e p o r t X m l P a r t   x m l n s = " u r n : m i c r o s o f t - d y n a m i c s - b u s i n e s s c e n t r a l / i n t e r n a l / e x t e n d e d / r e p o r t s / E m a i l _ M e r g e / 5 0 8 4 / " > - 
-     < B C R e p o r t I n f o r m a t i o n > - 
-         < R e p o r t M e t a d a t a > - 
-             < E x t e n s i o n I d > E x t e n s i o n   I D < / E x t e n s i o n I d > - 
-             < E x t e n s i o n N a m e > E x t e n s i o n   N a m e < / E x t e n s i o n N a m e > - 
-             < E x t e n s i o n P u b l i s h e r > E x t e n s i o n   P u b l i s h e r < / E x t e n s i o n P u b l i s h e r > - 
-             < E x t e n s i o n V e r s i o n > E x t e n s i o n   V e r s i o n < / E x t e n s i o n V e r s i o n > - 
-             < R e p o r t I d > R e p o r t   I D < / R e p o r t I d > - 
-             < R e p o r t N a m e > R e p o r t   N a m e < / R e p o r t N a m e > - 
-             < R e p o r t C a p t i o n > R e p o r t   C a p t i o n < / R e p o r t C a p t i o n > - 
-             < A b o u t T h i s R e p o r t T i t l e > A b o u t   T h i s   R e p o r t   T i t l e < / A b o u t T h i s R e p o r t T i t l e > - 
-             < A b o u t T h i s R e p o r t T e x t > A b o u t   T h i s   R e p o r t   T e x t < / A b o u t T h i s R e p o r t T e x t > - 
-             < R e p o r t H e l p L i n k > R e p o r t   H e l p   L i n k < / R e p o r t H e l p L i n k > - 
-         < / R e p o r t M e t a d a t a > - 
-         < R e p o r t R e q u e s t > - 
-             < T e n a n t E n t r a I d > T e n a n t   E n t r a   I d < / T e n a n t E n t r a I d > - 
-             < E n v i r o n m e n t N a m e > E n v i r o n m e n t   N a m e < / E n v i r o n m e n t N a m e > - 
-             < E n v i r o n m e n t T y p e > E n v i r o n m e n t   T y p e < / E n v i r o n m e n t T y p e > - 
-             < C o m p a n y N a m e > C o m p a n y   N a m e < / C o m p a n y N a m e > - 
-             < C o m p a n y D i s p l a y N a m e > C o m p a n y   D i s p l a y   N a m e < / C o m p a n y D i s p l a y N a m e > - 
-             < C o m p a n y I d > C o m p a n y   I D < / C o m p a n y I d > - 
-             < U s e r N a m e > U s e r   N a m e < / U s e r N a m e > - 
-             < D a t e A n d T i m e > D a t e   a n d   T i m e < / D a t e A n d T i m e > - 
-             < L a n g u a g e > L a n g u a g e < / L a n g u a g e > - 
-             < F o r m a t R e g i o n > F o r m a t   R e g i o n < / F o r m a t R e g i o n > - 
-             < D a t e T i m e V a l u e s > - 
-                 < Y e a r > Y e a r < / Y e a r > - 
-                 < M o n t h N u m b e r > M o n t h   N u m b e r < / M o n t h N u m b e r > - 
-                 < D a y N u m b e r > D a y   N u m b e r < / D a y N u m b e r > - 
-                 < H o u r > H o u r < / H o u r > - 
-                 < M i n u t e > M i n u t e < / M i n u t e > - 
-             < / D a t e T i m e V a l u e s > - 
-         < / R e p o r t R e q u e s t > - 
-         < C o m p a n y M e t a d a t a > - 
-             < C o m p a n y N a m e > C o m p a n y   N a m e < / C o m p a n y N a m e > - 
-             < C o m p a n y D i s p l a y N a m e > C o m p a n y   D i s p l a y   N a m e < / C o m p a n y D i s p l a y N a m e > - 
-             < C o m p a n y A d d r e s s L i n e s > - 
-                 < C o m p a n y A d d r e s s L i n e 1 > C o m p a n y   A d d r e s s   L i n e   1 < / C o m p a n y A d d r e s s L i n e 1 > - 
-                 < C o m p a n y A d d r e s s L i n e 2 > C o m p a n y   A d d r e s s   L i n e   2 < / C o m p a n y A d d r e s s L i n e 2 > - 
-                 < C o m p a n y A d d r e s s L i n e 3 > C o m p a n y   A d d r e s s   L i n e   3 < / C o m p a n y A d d r e s s L i n e 3 > - 
-                 < C o m p a n y A d d r e s s L i n e 4 > C o m p a n y   A d d r e s s   L i n e   4 < / C o m p a n y A d d r e s s L i n e 4 > - 
-                 < C o m p a n y A d d r e s s L i n e 5 > C o m p a n y   A d d r e s s   L i n e   5 < / C o m p a n y A d d r e s s L i n e 5 > - 
-                 < C o m p a n y A d d r e s s L i n e 6 > C o m p a n y   A d d r e s s   L i n e   6 < / C o m p a n y A d d r e s s L i n e 6 > - 
-                 < C o m p a n y A d d r e s s L i n e 7 > C o m p a n y   A d d r e s s   L i n e   7 < / C o m p a n y A d d r e s s L i n e 7 > - 
-                 < C o m p a n y A d d r e s s L i n e 8 > C o m p a n y   A d d r e s s   L i n e   8 < / C o m p a n y A d d r e s s L i n e 8 > - 
-             < / C o m p a n y A d d r e s s L i n e s > - 
-             < C o m p a n y P h o n e > C o m p a n y   P h o n e < / C o m p a n y P h o n e > - 
-             < C o m p a n y P h o n e C a p t i o n > C o m p a n y   P h o n e   C a p t i o n < / C o m p a n y P h o n e C a p t i o n > - 
-             < C o m p a n y F a x N o > C o m p a n y   F a x   N o . < / C o m p a n y F a x N o > - 
-             < C o m p a n y F a x N o C a p t i o n > C o m p a n y   F a x   N o .   C a p t i o n < / C o m p a n y F a x N o C a p t i o n > - 
-             < C o m p a n y E m a i l > C o m p a n y   E m a i l < / C o m p a n y E m a i l > - 
-             < C o m p a n y E m a i l C a p t i o n > C o m p a n y   E m a i l   C a p t i o n < / C o m p a n y E m a i l C a p t i o n > - 
-             < C o m p a n y H o m e P a g e > C o m p a n y   H o m e   P a g e < / C o m p a n y H o m e P a g e > - 
-             < C o m p a n y H o m e P a g e C a p t i o n > C o m p a n y   H o m e   P a g e   C a p t i o n < / C o m p a n y H o m e P a g e C a p t i o n > - 
-             < C o m p a n y L o g o > C o m p a n y   L o g o < / C o m p a n y L o g o > - 
-             < C o m p a n y V A T R e g i s t r a t i o n N o > C o m p a n y   V A T   R e g i s t r a t i o n   N o . < / C o m p a n y V A T R e g i s t r a t i o n N o > - 
-             < C o m p a n y V A T R e g i s t r a t i o n N o C a p t i o n > C o m p a n y   V A T   R e g i s t r a t i o n   N o .   C a p t i o n < / C o m p a n y V A T R e g i s t r a t i o n N o C a p t i o n > - 
-             < C o m p a n y R e g i s t r a t i o n N o > C o m p a n y   R e g i s t r a t i o n   N o . < / C o m p a n y R e g i s t r a t i o n N o > - 
-             < C o m p a n y R e g i s t r a t i o n N o C a p t i o n > C o m p a n y   R e g i s t r a t i o n   N o .   C a p t i o n < / C o m p a n y R e g i s t r a t i o n N o C a p t i o n > - 
-             < C o m p a n y B a n k N a m e > C o m p a n y   B a n k   N a m e < / C o m p a n y B a n k N a m e > - 
-             < C o m p a n y B a n k N a m e C a p t i o n > C o m p a n y   B a n k   N a m e   C a p t i o n < / C o m p a n y B a n k N a m e C a p t i o n > - 
-             < C o m p a n y B a n k A c c o u n t N o > C o m p a n y   B a n k   A c c o u n t   N o . < / C o m p a n y B a n k A c c o u n t N o > - 
-             < C o m p a n y B a n k A c c o u n t N o C a p t i o n > C o m p a n y   B a n k   A c c o u n t   N o .   C a p t i o n < / C o m p a n y B a n k A c c o u n t N o C a p t i o n > - 
-             < C o m p a n y B a n k B r a n c h N o > C o m p a n y   B a n k   B r a n c h   N o . < / C o m p a n y B a n k B r a n c h N o > - 
-             < C o m p a n y B a n k B r a n c h N o C a p t i o n > C o m p a n y   B a n k   B r a n c h   N o .   C a p t i o n < / C o m p a n y B a n k B r a n c h N o C a p t i o n > - 
-             < C o m p a n y I B A N > C o m p a n y   I B A N < / C o m p a n y I B A N > - 
-             < C o m p a n y I B A N C a p t i o n > C o m p a n y   I B A N   C a p t i o n < / C o m p a n y I B A N C a p t i o n > - 
-             < C o m p a n y B a n k S W I F T > C o m p a n y   B a n k   S W I F T < / C o m p a n y B a n k S W I F T > - 
-             < C o m p a n y B a n k S W I F T C a p t i o n > C o m p a n y   B a n k   S W I F T   C a p t i o n < / C o m p a n y B a n k S W I F T C a p t i o n > - 
-             < C o m p a n y G i r o N o > C o m p a n y   G i r o   N o . < / C o m p a n y G i r o N o > - 
-             < C o m p a n y G i r o N o C a p t i o n > C o m p a n y   G i r o   N o .   C a p t i o n < / C o m p a n y G i r o N o C a p t i o n > - 
-         < / C o m p a n y M e t a d a t a > - 
-     < / B C R e p o r t I n f o r m a t i o n > - 
-     < T o o l t i p s > - 
-         < T o o l t i p   c o l u m n = " C o m p a n y _ I n f o r m a t i o n _ P i c t u r e "   E l e m e n t I d = " 8 3 5 3 5 2 0 0 6 " > - 
-             < T o o l t i p T e x t   l a n g = " e n - U S " > S p e c i f i e s   t h e   p i c t u r e   t h a t   h a s   b e e n   s e t   u p   f o r   t h e   c o m p a n y ,   s u c h   a s   a   c o m p a n y   l o g o . < / T o o l t i p T e x t > - 
-         < / T o o l t i p > - 
-         < T o o l t i p   c o l u m n = " C o m p a n y _ I n f o r m a t i o n _ N a m e "   E l e m e n t I d = " 3 1 0 5 7 6 0 0 9 " > - 
-             < T o o l t i p T e x t   l a n g = " e n - U S " > S p e c i f i e s   t h e   c o m p a n y ' s   n a m e   a n d   c o r p o r a t e   f o r m .   F o r   e x a m p l e ,   I n c .   o r   L t d . < / T o o l t i p T e x t > - 
-         < / T o o l t i p > - 
-         < T o o l t i p   c o l u m n = " C o m p a n y _ I n f o r m a t i o n _ A d d r e s s "   E l e m e n t I d = " 8 0 9 9 4 7 6 8 0 " > - 
-             < T o o l t i p T e x t   l a n g = " e n - U S " > S p e c i f i e s   t h e   c o m p a n y ' s   a d d r e s s . < / T o o l t i p T e x t > - 
-         < / T o o l t i p > - 
-         < T o o l t i p   c o l u m n = " C o m p a n y _ I n f o r m a t i o n _ A d d r e s s _ 2 "   E l e m e n t I d = " 2 4 8 5 5 4 4 3 " > - 
-             < T o o l t i p T e x t   l a n g = " e n - U S " > S p e c i f i e s   a d d i t i o n a l   a d d r e s s   i n f o r m a t i o n . < / T o o l t i p T e x t > - 
-         < / T o o l t i p > - 
-         < T o o l t i p   c o l u m n = " C o m p a n y _ I n f o r m a t i o n _ P o s t _ C o d e "   E l e m e n t I d = " 1 7 3 1 9 5 5 0 2 8 " > - 
-             < T o o l t i p T e x t   l a n g = " e n - U S " > S p e c i f i e s   t h e   p o s t a l   c o d e . < / T o o l t i p T e x t > - 
-         < / T o o l t i p > - 
-         < T o o l t i p   c o l u m n = " C o m p a n y _ I n f o r m a t i o n _ C i t y "   E l e m e n t I d = " 1 0 0 2 4 9 4 2 6 5 " > - 
-             < T o o l t i p T e x t   l a n g = " e n - U S " > S p e c i f i e s   t h e   c o m p a n y ' s   c i t y . < / T o o l t i p T e x t > - 
-         < / T o o l t i p > - 
-         < T o o l t i p   c o l u m n = " S a l e s p e r s o n P u r c h a s e r _ N a m e "   E l e m e n t I d = " 1 9 0 9 5 6 4 5 7 " > - 
-             < T o o l t i p T e x t   l a n g = " e n - U S " > S p e c i f i e s   t h e   n a m e   o f   t h e   s a l e s p e r s o n   o r   p u r c h a s e r . < / T o o l t i p T e x t > - 
-         < / T o o l t i p > - 
-         < T o o l t i p   c o l u m n = " S a l e s p e r s o n P u r c h a s e r _ J o b _ T i t l e "   E l e m e n t I d = " 1 9 4 4 9 3 6 3 9 8 " > - 
-             < T o o l t i p T e x t   l a n g = " e n - U S " > S p e c i f i e s   t h e   s a l e s p e r s o n ' s   j o b   t i t l e . < / T o o l t i p T e x t > - 
-         < / T o o l t i p > - 
-     < / T o o l t i p s > - 
-     < I n t e g e r   E l e m e n t T y p e = " D a t a I t e m "   E l e m e n t I d = " 1 7 3 5 6 9 8 6 1 9 " > - 
-         < C o m p a n y _ I n f o r m a t i o n _ A d d r e s s   E l e m e n t T y p e = " C o l u m n "   E l e m e n t I d = " 8 0 9 9 4 7 6 8 0 "   D a t a T y p e = " T e x t " > C o m p a n y _ I n f o r m a t i o n _ A d d r e s s < / C o m p a n y _ I n f o r m a t i o n _ A d d r e s s > - 
-         < C o m p a n y _ I n f o r m a t i o n _ A d d r e s s _ 2   E l e m e n t T y p e = " C o l u m n "   E l e m e n t I d = " 2 4 8 5 5 4 4 3 "   D a t a T y p e = " T e x t " > C o m p a n y _ I n f o r m a t i o n _ A d d r e s s _ 2 < / C o m p a n y _ I n f o r m a t i o n _ A d d r e s s _ 2 > - 
-         < C o m p a n y _ I n f o r m a t i o n _ C i t y   E l e m e n t T y p e = " C o l u m n "   E l e m e n t I d = " 1 0 0 2 4 9 4 2 6 5 "   D a t a T y p e = " T e x t " > C o m p a n y _ I n f o r m a t i o n _ C i t y < / C o m p a n y _ I n f o r m a t i o n _ C i t y > - 
-         < C o m p a n y _ I n f o r m a t i o n _ N a m e   E l e m e n t T y p e = " C o l u m n "   E l e m e n t I d = " 3 1 0 5 7 6 0 0 9 "   D a t a T y p e = " T e x t " > C o m p a n y _ I n f o r m a t i o n _ N a m e < / C o m p a n y _ I n f o r m a t i o n _ N a m e > - 
-         < C o m p a n y _ I n f o r m a t i o n _ P i c t u r e   E l e m e n t T y p e = " C o l u m n "   E l e m e n t I d = " 8 3 5 3 5 2 0 0 6 "   D a t a T y p e = " B l o b "   / > - 
-         < C o m p a n y _ I n f o r m a t i o n _ P o s t _ C o d e   E l e m e n t T y p e = " C o l u m n "   E l e m e n t I d = " 1 7 3 1 9 5 5 0 2 8 "   D a t a T y p e = " C o d e " > C o m p a n y _ I n f o r m a t i o n _ P o s t _ C o d e < / C o m p a n y _ I n f o r m a t i o n _ P o s t _ C o d e > - 
-         < C o n t a c t _ M a i l _ A d d r e s s   E l e m e n t T y p e = " C o l u m n "   E l e m e n t I d = " 7 2 2 4 3 5 0 1 0 "   D a t a T y p e = " T e x t " > C o n t a c t _ M a i l _ A d d r e s s < / C o n t a c t _ M a i l _ A d d r e s s > - 
-         < C o n t e n t   E l e m e n t T y p e = " C o l u m n "   E l e m e n t I d = " 1 8 6 9 8 1 8 0 "   D a t a T y p e = " T e x t " > C o n t e n t < / C o n t e n t > - 
-         < D o c u m e n t _ D a t e   E l e m e n t T y p e = " C o l u m n "   E l e m e n t I d = " 1 9 4 9 1 9 0 9 2 9 "   D a t a T y p e = " T e x t " > D o c u m e n t _ D a t e < / D o c u m e n t _ D a t e > - 
-         < F o r m a l _ S a l u t a t i o n   E l e m e n t T y p e = " C o l u m n "   E l e m e n t I d = " 3 3 5 7 4 7 4 7 7 "   D a t a T y p e = " T e x t " > F o r m a l _ S a l u t a t i o n < / F o r m a l _ S a l u t a t i o n > - 
-         < I n f o r m a l _ S a l u t a t i o n   E l e m e n t T y p e = " C o l u m n "   E l e m e n t I d = " 1 3 0 0 0 5 0 7 4 0 "   D a t a T y p e = " T e x t " > I n f o r m a l _ S a l u t a t i o n < / I n f o r m a l _ S a l u t a t i o n > - 
-         < S a l e s p e r s o n P u r c h a s e r _ J o b _ T i t l e   E l e m e n t T y p e = " C o l u m n "   E l e m e n t I d = " 1 9 4 4 9 3 6 3 9 8 "   D a t a T y p e = " T e x t " > S a l e s p e r s o n P u r c h a s e r _ J o b _ T i t l e < / S a l e s p e r s o n P u r c h a s e r _ J o b _ T i t l e > - 
-         < S a l e s p e r s o n P u r c h a s e r _ N a m e   E l e m e n t T y p e = " C o l u m n "   E l e m e n t I d = " 1 9 0 9 5 6 4 5 7 "   D a t a T y p e = " T e x t " > S a l e s p e r s o n P u r c h a s e r _ N a m e < / S a l e s p e r s o n P u r c h a s e r _ N a m e >   
      < / I n t e g e r >   

</xml_diff>